<commit_message>
Update abstract and add generation datasets
</commit_message>
<xml_diff>
--- a/docs/ALT_Abstract.docx
+++ b/docs/ALT_Abstract.docx
@@ -1,6 +1,6 @@
 
 <file path=word/document.xml><?xml version="1.0" encoding="utf-8"?>
-<w:document xmlns:wpc="http://schemas.microsoft.com/office/word/2010/wordprocessingCanvas" xmlns:cx="http://schemas.microsoft.com/office/drawing/2014/chartex" xmlns:cx1="http://schemas.microsoft.com/office/drawing/2015/9/8/chartex" xmlns:cx2="http://schemas.microsoft.com/office/drawing/2015/10/21/chartex" xmlns:cx3="http://schemas.microsoft.com/office/drawing/2016/5/9/chartex" xmlns:cx4="http://schemas.microsoft.com/office/drawing/2016/5/10/chartex" xmlns:cx5="http://schemas.microsoft.com/office/drawing/2016/5/11/chartex" xmlns:cx6="http://schemas.microsoft.com/office/drawing/2016/5/12/chartex" xmlns:cx7="http://schemas.microsoft.com/office/drawing/2016/5/13/chartex" xmlns:cx8="http://schemas.microsoft.com/office/drawing/2016/5/14/chartex" xmlns:mc="http://schemas.openxmlformats.org/markup-compatibility/2006" xmlns:aink="http://schemas.microsoft.com/office/drawing/2016/ink" xmlns:am3d="http://schemas.microsoft.com/office/drawing/2017/model3d" xmlns:o="urn:schemas-microsoft-com:office:office" xmlns:oel="http://schemas.microsoft.com/office/2019/extlst" xmlns:r="http://schemas.openxmlformats.org/officeDocument/2006/relationships" xmlns:m="http://schemas.openxmlformats.org/officeDocument/2006/math" xmlns:v="urn:schemas-microsoft-com:vml" xmlns:wp14="http://schemas.microsoft.com/office/word/2010/wordprocessingDrawing" xmlns:wp="http://schemas.openxmlformats.org/drawingml/2006/wordprocessingDrawing" xmlns:w10="urn:schemas-microsoft-com:office:word" xmlns:w="http://schemas.openxmlformats.org/wordprocessingml/2006/main" xmlns:w14="http://schemas.microsoft.com/office/word/2010/wordml" xmlns:w15="http://schemas.microsoft.com/office/word/2012/wordml" xmlns:w16cei="http://schemas.microsoft.com/office/word/2026/wordml/cei" xmlns:w16cex="http://schemas.microsoft.com/office/word/2018/wordml/cex" xmlns:w16cid="http://schemas.microsoft.com/office/word/2016/wordml/cid" xmlns:w16="http://schemas.microsoft.com/office/word/2018/wordml" xmlns:w16du="http://schemas.microsoft.com/office/word/2023/wordml/word16du" xmlns:w16sdtdh="http://schemas.microsoft.com/office/word/2020/wordml/sdtdatahash" xmlns:w16sdtfl="http://schemas.microsoft.com/office/word/2024/wordml/sdtformatlock" xmlns:w16se="http://schemas.microsoft.com/office/word/2015/wordml/symex" xmlns:wpg="http://schemas.microsoft.com/office/word/2010/wordprocessingGroup" xmlns:wpi="http://schemas.microsoft.com/office/word/2010/wordprocessingInk" xmlns:wne="http://schemas.microsoft.com/office/word/2006/wordml" xmlns:wps="http://schemas.microsoft.com/office/word/2010/wordprocessingShape" mc:Ignorable="w14 w15 w16se w16cid w16 w16cex w16sdtdh w16sdtfl w16du wp14">
+<w:document xmlns:wpc="http://schemas.microsoft.com/office/word/2010/wordprocessingCanvas" xmlns:cx="http://schemas.microsoft.com/office/drawing/2014/chartex" xmlns:cx1="http://schemas.microsoft.com/office/drawing/2015/9/8/chartex" xmlns:cx2="http://schemas.microsoft.com/office/drawing/2015/10/21/chartex" xmlns:cx3="http://schemas.microsoft.com/office/drawing/2016/5/9/chartex" xmlns:cx4="http://schemas.microsoft.com/office/drawing/2016/5/10/chartex" xmlns:cx5="http://schemas.microsoft.com/office/drawing/2016/5/11/chartex" xmlns:cx6="http://schemas.microsoft.com/office/drawing/2016/5/12/chartex" xmlns:cx7="http://schemas.microsoft.com/office/drawing/2016/5/13/chartex" xmlns:cx8="http://schemas.microsoft.com/office/drawing/2016/5/14/chartex" xmlns:mc="http://schemas.openxmlformats.org/markup-compatibility/2006" xmlns:aink="http://schemas.microsoft.com/office/drawing/2016/ink" xmlns:am3d="http://schemas.microsoft.com/office/drawing/2017/model3d" xmlns:o="urn:schemas-microsoft-com:office:office" xmlns:oel="http://schemas.microsoft.com/office/2019/extlst" xmlns:r="http://schemas.openxmlformats.org/officeDocument/2006/relationships" xmlns:m="http://schemas.openxmlformats.org/officeDocument/2006/math" xmlns:v="urn:schemas-microsoft-com:vml" xmlns:wp14="http://schemas.microsoft.com/office/word/2010/wordprocessingDrawing" xmlns:wp="http://schemas.openxmlformats.org/drawingml/2006/wordprocessingDrawing" xmlns:w10="urn:schemas-microsoft-com:office:word" xmlns:w="http://schemas.openxmlformats.org/wordprocessingml/2006/main" xmlns:w14="http://schemas.microsoft.com/office/word/2010/wordml" xmlns:w15="http://schemas.microsoft.com/office/word/2012/wordml" xmlns:w16cex="http://schemas.microsoft.com/office/word/2018/wordml/cex" xmlns:w16cid="http://schemas.microsoft.com/office/word/2016/wordml/cid" xmlns:w16="http://schemas.microsoft.com/office/word/2018/wordml" xmlns:w16du="http://schemas.microsoft.com/office/word/2023/wordml/word16du" xmlns:w16sdtdh="http://schemas.microsoft.com/office/word/2020/wordml/sdtdatahash" xmlns:w16sdtfl="http://schemas.microsoft.com/office/word/2024/wordml/sdtformatlock" xmlns:w16se="http://schemas.microsoft.com/office/word/2015/wordml/symex" xmlns:wpg="http://schemas.microsoft.com/office/word/2010/wordprocessingGroup" xmlns:wpi="http://schemas.microsoft.com/office/word/2010/wordprocessingInk" xmlns:wne="http://schemas.microsoft.com/office/word/2006/wordml" xmlns:wps="http://schemas.microsoft.com/office/word/2010/wordprocessingShape" mc:Ignorable="w14 w15 w16se w16cid w16 w16cex w16sdtdh w16sdtfl w16du wp14">
   <w:body>
     <w:p>
       <w:pPr>
@@ -21,14 +21,7 @@
           <w:sz w:val="40"/>
           <w:szCs w:val="40"/>
         </w:rPr>
-        <w:t xml:space="preserve"> </w:t>
-      </w:r>
-      <w:r>
-        <w:rPr>
-          <w:sz w:val="40"/>
-          <w:szCs w:val="40"/>
-        </w:rPr>
-        <w:t>AI Framework for Solar Power Generation Forecasting</w:t>
+        <w:t xml:space="preserve"> AI Framework for Solar Power Generation Forecasting</w:t>
       </w:r>
     </w:p>
     <w:p>
@@ -43,14 +36,7 @@
           <w:sz w:val="48"/>
           <w:szCs w:val="48"/>
         </w:rPr>
-        <w:t>Abstract</w:t>
-      </w:r>
-      <w:r>
-        <w:rPr>
-          <w:sz w:val="48"/>
-          <w:szCs w:val="48"/>
-        </w:rPr>
-        <w:t>:</w:t>
+        <w:t>Abstract:</w:t>
       </w:r>
     </w:p>
     <w:p>
@@ -106,8 +92,8 @@
         <w:tblLook w:val="04A0" w:firstRow="1" w:lastRow="0" w:firstColumn="1" w:lastColumn="0" w:noHBand="0" w:noVBand="1"/>
       </w:tblPr>
       <w:tblGrid>
-        <w:gridCol w:w="1765"/>
-        <w:gridCol w:w="7251"/>
+        <w:gridCol w:w="4241"/>
+        <w:gridCol w:w="4775"/>
       </w:tblGrid>
       <w:tr>
         <w:tc>
@@ -115,18 +101,7 @@
             <w:tcW w:w="4508" w:type="dxa"/>
           </w:tcPr>
           <w:p>
-            <w:pPr>
-              <w:jc w:val="center"/>
-              <w:rPr>
-                <w:sz w:val="36"/>
-                <w:szCs w:val="36"/>
-              </w:rPr>
-            </w:pPr>
             <w:r>
-              <w:rPr>
-                <w:sz w:val="36"/>
-                <w:szCs w:val="36"/>
-              </w:rPr>
               <w:t>Dataset</w:t>
             </w:r>
           </w:p>
@@ -136,19 +111,8 @@
             <w:tcW w:w="4508" w:type="dxa"/>
           </w:tcPr>
           <w:p>
-            <w:pPr>
-              <w:jc w:val="center"/>
-              <w:rPr>
-                <w:sz w:val="36"/>
-                <w:szCs w:val="36"/>
-              </w:rPr>
-            </w:pPr>
             <w:r>
-              <w:rPr>
-                <w:sz w:val="36"/>
-                <w:szCs w:val="36"/>
-              </w:rPr>
-              <w:t>URL link</w:t>
+              <w:t>Kaggle URL</w:t>
             </w:r>
           </w:p>
         </w:tc>
@@ -159,27 +123,8 @@
             <w:tcW w:w="4508" w:type="dxa"/>
           </w:tcPr>
           <w:p>
-            <w:pPr>
-              <w:rPr>
-                <w:sz w:val="36"/>
-                <w:szCs w:val="36"/>
-              </w:rPr>
-            </w:pPr>
-            <w:proofErr w:type="spellStart"/>
             <w:r>
-              <w:rPr>
-                <w:sz w:val="36"/>
-                <w:szCs w:val="36"/>
-              </w:rPr>
-              <w:t>PVOutput</w:t>
-            </w:r>
-            <w:proofErr w:type="spellEnd"/>
-            <w:r>
-              <w:rPr>
-                <w:sz w:val="36"/>
-                <w:szCs w:val="36"/>
-              </w:rPr>
-              <w:t xml:space="preserve"> Solar Generation Dataset</w:t>
+              <w:t>Solar Power Generation Data (primary dataset)</w:t>
             </w:r>
           </w:p>
         </w:tc>
@@ -188,18 +133,8 @@
             <w:tcW w:w="4508" w:type="dxa"/>
           </w:tcPr>
           <w:p>
-            <w:pPr>
-              <w:rPr>
-                <w:sz w:val="36"/>
-                <w:szCs w:val="36"/>
-              </w:rPr>
-            </w:pPr>
             <w:r>
-              <w:rPr>
-                <w:sz w:val="36"/>
-                <w:szCs w:val="36"/>
-              </w:rPr>
-              <w:t>https://pvoutput.org/</w:t>
+              <w:t>https://www.kaggle.com/datasets/anikannal/solar-power-generation-data</w:t>
             </w:r>
           </w:p>
         </w:tc>
@@ -210,26 +145,8 @@
             <w:tcW w:w="4508" w:type="dxa"/>
           </w:tcPr>
           <w:p>
-            <w:pPr>
-              <w:rPr>
-                <w:sz w:val="36"/>
-                <w:szCs w:val="36"/>
-              </w:rPr>
-            </w:pPr>
             <w:r>
-              <w:rPr>
-                <w:sz w:val="36"/>
-                <w:szCs w:val="36"/>
-              </w:rPr>
-              <w:t xml:space="preserve">Open Power System </w:t>
-            </w:r>
-            <w:r>
-              <w:rPr>
-                <w:sz w:val="36"/>
-                <w:szCs w:val="36"/>
-              </w:rPr>
-              <w:lastRenderedPageBreak/>
-              <w:t>Data (OPSD</w:t>
+              <w:t>Short-term Solar Power Forecasting</w:t>
             </w:r>
           </w:p>
         </w:tc>
@@ -238,19 +155,8 @@
             <w:tcW w:w="4508" w:type="dxa"/>
           </w:tcPr>
           <w:p>
-            <w:pPr>
-              <w:rPr>
-                <w:sz w:val="36"/>
-                <w:szCs w:val="36"/>
-              </w:rPr>
-            </w:pPr>
             <w:r>
-              <w:rPr>
-                <w:sz w:val="36"/>
-                <w:szCs w:val="36"/>
-              </w:rPr>
-              <w:lastRenderedPageBreak/>
-              <w:t>https://open-power-system-data.org/</w:t>
+              <w:t>https://www.kaggle.com/competitions/short-term-solar-power-forecasting/data</w:t>
             </w:r>
           </w:p>
         </w:tc>
@@ -261,18 +167,8 @@
             <w:tcW w:w="4508" w:type="dxa"/>
           </w:tcPr>
           <w:p>
-            <w:pPr>
-              <w:rPr>
-                <w:sz w:val="36"/>
-                <w:szCs w:val="36"/>
-              </w:rPr>
-            </w:pPr>
             <w:r>
-              <w:rPr>
-                <w:sz w:val="36"/>
-                <w:szCs w:val="36"/>
-              </w:rPr>
-              <w:t>Kaggle – Solar Power Generation Data</w:t>
+              <w:t>Solar Generation Forecasting Challenge</w:t>
             </w:r>
           </w:p>
         </w:tc>
@@ -281,18 +177,8 @@
             <w:tcW w:w="4508" w:type="dxa"/>
           </w:tcPr>
           <w:p>
-            <w:pPr>
-              <w:rPr>
-                <w:sz w:val="36"/>
-                <w:szCs w:val="36"/>
-              </w:rPr>
-            </w:pPr>
             <w:r>
-              <w:rPr>
-                <w:sz w:val="36"/>
-                <w:szCs w:val="36"/>
-              </w:rPr>
-              <w:t>https://www.kaggle.com/datasets/anikannal/solar-power-generation-data</w:t>
+              <w:t>https://www.kaggle.com/c/solar-generation-forecasting-challenge/data</w:t>
             </w:r>
           </w:p>
         </w:tc>
@@ -309,7 +195,7 @@
     <w:p>
       <w:pPr>
         <w:pStyle w:val="Heading1"/>
-        <w:spacing w:before="160" w:after="80"/>
+        <w:spacing w:before="160"/>
       </w:pPr>
       <w:r>
         <w:t>Technologies Used</w:t>
@@ -365,6 +251,7 @@
         <w:rPr>
           <w:b/>
         </w:rPr>
+        <w:lastRenderedPageBreak/>
         <w:t xml:space="preserve">Deep Learning: </w:t>
       </w:r>
       <w:r>
@@ -404,13 +291,7 @@
         <w:spacing w:after="40"/>
       </w:pPr>
       <w:r>
-        <w:rPr>
-          <w:b/>
-        </w:rPr>
-        <w:t xml:space="preserve">Data Sources: </w:t>
-      </w:r>
-      <w:r>
-        <w:t>PVOutput, Open Power System Data (OPSD), and Kaggle Solar Power Generation Dataset</w:t>
+        <w:t>Data Sources: Kaggle solar power generation and solar power forecasting datasets only</w:t>
       </w:r>
     </w:p>
     <w:p>
@@ -418,7 +299,7 @@
         <w:spacing w:before="60" w:after="120"/>
       </w:pPr>
       <w:r>
-        <w:t>Note: The AI models and dataset sources are named in the project document. The software libraries and development environment above are suggested implementation tools.</w:t>
+        <w:t>Note: Only Kaggle-hosted datasets are listed. The Solar Power Generation Data dataset is recommended as the primary dataset because it includes power-generation records and weather-sensor readings for two solar power plants in India. The other Kaggle links are alternatives for forecasting experiments.</w:t>
       </w:r>
     </w:p>
     <w:p>
@@ -1648,6 +1529,7 @@
   <w:style w:type="character" w:default="1" w:styleId="DefaultParagraphFont">
     <w:name w:val="Default Paragraph Font"/>
     <w:uiPriority w:val="1"/>
+    <w:semiHidden/>
     <w:unhideWhenUsed/>
   </w:style>
   <w:style w:type="table" w:default="1" w:styleId="TableNormal">

</xml_diff>